<commit_message>
fix(rules): leave space indentation to PR-05 so TY-06 does not repeat it
Co-Authored-By: Claude Opus 5.5 <noreply@anthropic.com>
</commit_message>
<xml_diff>
--- a/fixtures/TY-06/bad.docx
+++ b/fixtures/TY-06/bad.docx
@@ -680,6 +680,11 @@
     <w:p>
       <w:r>
         <w:t xml:space="preserve">Абзац с пробелом в конце. </w:t>
+      </w:r>
+    </w:p>
+    <w:p>
+      <w:r>
+        <w:t xml:space="preserve"> Абзац с одним пробелом в начале.</w:t>
       </w:r>
     </w:p>
     <w:p>

</xml_diff>